<commit_message>
Update Assignment 3: Set Department of Data Science, streamline compliance matrix to 2 columns, remove test table, and regenerate submission docx
</commit_message>
<xml_diff>
--- a/Assignment_3/Assignment_3_Report_Sameet_Pisal_202401120018.docx
+++ b/Assignment_3/Assignment_3_Report_Sameet_Pisal_202401120018.docx
@@ -24,7 +24,7 @@
           <w:color w:val="1E1E1E"/>
           <w:sz w:val="22"/>
         </w:rPr>
-        <w:t>DEPARTMENT OF COMPUTER ENGINEERING</w:t>
+        <w:t>DEPARTMENT OF DATA SCIENCE</w:t>
         <w:br/>
       </w:r>
       <w:r>
@@ -180,6 +180,66 @@
                 <w:sz w:val="19"/>
               </w:rPr>
               <w:t>202401120018</w:t>
+            </w:r>
+          </w:p>
+        </w:tc>
+      </w:tr>
+      <w:tr>
+        <w:tc>
+          <w:tcPr>
+            <w:tcW w:type="dxa" w:w="3168"/>
+            <w:shd w:fill="F8F9FA"/>
+            <w:tcMar>
+              <w:top w:w="50" w:type="dxa"/>
+              <w:bottom w:w="50" w:type="dxa"/>
+              <w:left w:w="90" w:type="dxa"/>
+              <w:right w:w="90" w:type="dxa"/>
+            </w:tcMar>
+            <w:tcBorders>
+              <w:top w:val="single" w:sz="4" w:space="0" w:color="CCCCCC"/>
+              <w:bottom w:val="single" w:sz="4" w:space="0" w:color="CCCCCC"/>
+              <w:left w:val="single" w:sz="4" w:space="0" w:color="CCCCCC"/>
+              <w:right w:val="single" w:sz="4" w:space="0" w:color="CCCCCC"/>
+            </w:tcBorders>
+          </w:tcPr>
+          <w:p>
+            <w:r>
+              <w:rPr>
+                <w:rFonts w:ascii="Times New Roman" w:hAnsi="Times New Roman"/>
+                <w:b/>
+                <w:color w:val="000000"/>
+                <w:sz w:val="19"/>
+              </w:rPr>
+              <w:t>Academic Department:</w:t>
+            </w:r>
+          </w:p>
+        </w:tc>
+        <w:tc>
+          <w:tcPr>
+            <w:tcW w:type="dxa" w:w="6912"/>
+            <w:shd w:fill="FFFFFF"/>
+            <w:tcMar>
+              <w:top w:w="50" w:type="dxa"/>
+              <w:bottom w:w="50" w:type="dxa"/>
+              <w:left w:w="90" w:type="dxa"/>
+              <w:right w:w="90" w:type="dxa"/>
+            </w:tcMar>
+            <w:tcBorders>
+              <w:top w:val="single" w:sz="4" w:space="0" w:color="CCCCCC"/>
+              <w:bottom w:val="single" w:sz="4" w:space="0" w:color="CCCCCC"/>
+              <w:left w:val="single" w:sz="4" w:space="0" w:color="CCCCCC"/>
+              <w:right w:val="single" w:sz="4" w:space="0" w:color="CCCCCC"/>
+            </w:tcBorders>
+          </w:tcPr>
+          <w:p>
+            <w:r>
+              <w:rPr>
+                <w:rFonts w:ascii="Times New Roman" w:hAnsi="Times New Roman"/>
+                <w:b w:val="0"/>
+                <w:color w:val="000000"/>
+                <w:sz w:val="19"/>
+              </w:rPr>
+              <w:t>Department of Data Science</w:t>
             </w:r>
           </w:p>
         </w:tc>
@@ -411,7 +471,7 @@
           <w:color w:val="1E1E1E"/>
           <w:sz w:val="20"/>
         </w:rPr>
-        <w:t>Objective: The goal of this assignment is to engineer an enterprise-grade, clean, institutional Student Information Management System (SIMS) for MITAOE using modern React JS frontend architectural patterns. The application avoids overly flashy gimmicks in favor of a crisp, academic/corporate administrative dashboard design featuring real-time statistics cards, controlled forms with client-side validation, multi-field search and department filtering, dual view modes (Data Table vs. Grid Cards), inline record editing, safe deletion confirmation dialogs, and CSV record export.</w:t>
+        <w:t>Objective: The goal of this assignment is to engineer an enterprise-grade, clean, institutional Student Information Management System (SIMS) for the Department of Data Science at MITAOE using modern React JS frontend architectural patterns. The application provides a crisp, academic/corporate administrative dashboard design featuring real-time statistics cards, controlled forms with client-side validation, multi-field search and department filtering, dual view modes (Data Table vs. Grid Cards), inline record editing, safe deletion confirmation dialogs, and CSV record export.</w:t>
       </w:r>
     </w:p>
     <w:p>
@@ -442,7 +502,7 @@
           <w:color w:val="1E1E1E"/>
           <w:sz w:val="20"/>
         </w:rPr>
-        <w:t>Every core requirement specified in the assignment syllabus has been rigorously implemented and verified:</w:t>
+        <w:t>Mapping of every assignment syllabus requirement to its technical implementation in the React JS application:</w:t>
       </w:r>
     </w:p>
     <w:tbl>
@@ -452,14 +512,13 @@
         <w:tblLook w:firstColumn="1" w:firstRow="1" w:lastColumn="0" w:lastRow="0" w:noHBand="0" w:noVBand="1" w:val="04A0"/>
       </w:tblPr>
       <w:tblGrid>
-        <w:gridCol w:w="3360"/>
-        <w:gridCol w:w="3360"/>
-        <w:gridCol w:w="3360"/>
+        <w:gridCol w:w="5040"/>
+        <w:gridCol w:w="5040"/>
       </w:tblGrid>
       <w:tr>
         <w:tc>
           <w:tcPr>
-            <w:tcW w:type="dxa" w:w="3360"/>
+            <w:tcW w:type="dxa" w:w="3456"/>
             <w:shd w:fill="1E293B"/>
             <w:tcMar>
               <w:top w:w="60" w:type="dxa"/>
@@ -482,7 +541,7 @@
         </w:tc>
         <w:tc>
           <w:tcPr>
-            <w:tcW w:type="dxa" w:w="3360"/>
+            <w:tcW w:type="dxa" w:w="6624"/>
             <w:shd w:fill="1E293B"/>
             <w:tcMar>
               <w:top w:w="60" w:type="dxa"/>
@@ -503,34 +562,11 @@
             </w:r>
           </w:p>
         </w:tc>
-        <w:tc>
-          <w:tcPr>
-            <w:tcW w:type="dxa" w:w="3360"/>
-            <w:shd w:fill="1E293B"/>
-            <w:tcMar>
-              <w:top w:w="60" w:type="dxa"/>
-              <w:bottom w:w="60" w:type="dxa"/>
-              <w:left w:w="80" w:type="dxa"/>
-              <w:right w:w="80" w:type="dxa"/>
-            </w:tcMar>
-          </w:tcPr>
-          <w:p>
-            <w:r>
-              <w:rPr>
-                <w:rFonts w:ascii="Times New Roman" w:hAnsi="Times New Roman"/>
-                <w:b/>
-                <w:color w:val="FFFFFF"/>
-                <w:sz w:val="18"/>
-              </w:rPr>
-              <w:t>Compliance Verification</w:t>
-            </w:r>
-          </w:p>
-        </w:tc>
       </w:tr>
       <w:tr>
         <w:tc>
           <w:tcPr>
-            <w:tcW w:type="dxa" w:w="3360"/>
+            <w:tcW w:type="dxa" w:w="3456"/>
             <w:shd w:fill="FFFFFF"/>
             <w:tcMar>
               <w:top w:w="50" w:type="dxa"/>
@@ -559,7 +595,7 @@
         </w:tc>
         <w:tc>
           <w:tcPr>
-            <w:tcW w:type="dxa" w:w="3360"/>
+            <w:tcW w:type="dxa" w:w="6624"/>
             <w:shd w:fill="FFFFFF"/>
             <w:tcMar>
               <w:top w:w="50" w:type="dxa"/>
@@ -581,36 +617,7 @@
                 <w:color w:val="000000"/>
                 <w:sz w:val="17"/>
               </w:rPr>
-              <w:t>Modular hierarchy: Header, StudentStats, StudentForm, StudentFilterBar, StudentTable, StudentCard, DeleteConfirmModal</w:t>
-            </w:r>
-          </w:p>
-        </w:tc>
-        <w:tc>
-          <w:tcPr>
-            <w:tcW w:type="dxa" w:w="3360"/>
-            <w:shd w:fill="FFFFFF"/>
-            <w:tcMar>
-              <w:top w:w="50" w:type="dxa"/>
-              <w:bottom w:w="50" w:type="dxa"/>
-              <w:left w:w="70" w:type="dxa"/>
-              <w:right w:w="70" w:type="dxa"/>
-            </w:tcMar>
-            <w:tcBorders>
-              <w:top w:val="single" w:sz="4" w:space="0" w:color="CCCCCC"/>
-              <w:bottom w:val="single" w:sz="4" w:space="0" w:color="CCCCCC"/>
-              <w:left w:val="single" w:sz="4" w:space="0" w:color="CCCCCC"/>
-              <w:right w:val="single" w:sz="4" w:space="0" w:color="CCCCCC"/>
-            </w:tcBorders>
-          </w:tcPr>
-          <w:p>
-            <w:r>
-              <w:rPr>
-                <w:rFonts w:ascii="Times New Roman" w:hAnsi="Times New Roman"/>
-                <w:b/>
-                <w:color w:val="000000"/>
-                <w:sz w:val="17"/>
-              </w:rPr>
-              <w:t>100% Satisfied - Reusable, isolated components</w:t>
+              <w:t>Modular hierarchy: Header, StudentStats, StudentForm, StudentFilterBar, StudentTable, StudentCard, DeleteConfirmModal (reusable, isolated components)</w:t>
             </w:r>
           </w:p>
         </w:tc>
@@ -618,7 +625,7 @@
       <w:tr>
         <w:tc>
           <w:tcPr>
-            <w:tcW w:type="dxa" w:w="3360"/>
+            <w:tcW w:type="dxa" w:w="3456"/>
             <w:shd w:fill="F8F9FA"/>
             <w:tcMar>
               <w:top w:w="50" w:type="dxa"/>
@@ -647,7 +654,7 @@
         </w:tc>
         <w:tc>
           <w:tcPr>
-            <w:tcW w:type="dxa" w:w="3360"/>
+            <w:tcW w:type="dxa" w:w="6624"/>
             <w:shd w:fill="F8F9FA"/>
             <w:tcMar>
               <w:top w:w="50" w:type="dxa"/>
@@ -669,36 +676,7 @@
                 <w:color w:val="000000"/>
                 <w:sz w:val="17"/>
               </w:rPr>
-              <w:t>Unidirectional data flow passing callback handlers (onAddStudent, onUpdateStudent, onDelete) and state models</w:t>
-            </w:r>
-          </w:p>
-        </w:tc>
-        <w:tc>
-          <w:tcPr>
-            <w:tcW w:type="dxa" w:w="3360"/>
-            <w:shd w:fill="F8F9FA"/>
-            <w:tcMar>
-              <w:top w:w="50" w:type="dxa"/>
-              <w:bottom w:w="50" w:type="dxa"/>
-              <w:left w:w="70" w:type="dxa"/>
-              <w:right w:w="70" w:type="dxa"/>
-            </w:tcMar>
-            <w:tcBorders>
-              <w:top w:val="single" w:sz="4" w:space="0" w:color="CCCCCC"/>
-              <w:bottom w:val="single" w:sz="4" w:space="0" w:color="CCCCCC"/>
-              <w:left w:val="single" w:sz="4" w:space="0" w:color="CCCCCC"/>
-              <w:right w:val="single" w:sz="4" w:space="0" w:color="CCCCCC"/>
-            </w:tcBorders>
-          </w:tcPr>
-          <w:p>
-            <w:r>
-              <w:rPr>
-                <w:rFonts w:ascii="Times New Roman" w:hAnsi="Times New Roman"/>
-                <w:b/>
-                <w:color w:val="000000"/>
-                <w:sz w:val="17"/>
-              </w:rPr>
-              <w:t>100% Satisfied - Clean props contracts &amp; reusability</w:t>
+              <w:t>Unidirectional data flow passing callback handlers (onAddStudent, onUpdateStudent, onDelete) and state models across parent and child components</w:t>
             </w:r>
           </w:p>
         </w:tc>
@@ -706,7 +684,7 @@
       <w:tr>
         <w:tc>
           <w:tcPr>
-            <w:tcW w:type="dxa" w:w="3360"/>
+            <w:tcW w:type="dxa" w:w="3456"/>
             <w:shd w:fill="FFFFFF"/>
             <w:tcMar>
               <w:top w:w="50" w:type="dxa"/>
@@ -735,7 +713,7 @@
         </w:tc>
         <w:tc>
           <w:tcPr>
-            <w:tcW w:type="dxa" w:w="3360"/>
+            <w:tcW w:type="dxa" w:w="6624"/>
             <w:shd w:fill="FFFFFF"/>
             <w:tcMar>
               <w:top w:w="50" w:type="dxa"/>
@@ -757,36 +735,7 @@
                 <w:color w:val="000000"/>
                 <w:sz w:val="17"/>
               </w:rPr>
-              <w:t>React Hooks (useState, useEffect, useRef) combined with browser localStorage synchronization</w:t>
-            </w:r>
-          </w:p>
-        </w:tc>
-        <w:tc>
-          <w:tcPr>
-            <w:tcW w:type="dxa" w:w="3360"/>
-            <w:shd w:fill="FFFFFF"/>
-            <w:tcMar>
-              <w:top w:w="50" w:type="dxa"/>
-              <w:bottom w:w="50" w:type="dxa"/>
-              <w:left w:w="70" w:type="dxa"/>
-              <w:right w:w="70" w:type="dxa"/>
-            </w:tcMar>
-            <w:tcBorders>
-              <w:top w:val="single" w:sz="4" w:space="0" w:color="CCCCCC"/>
-              <w:bottom w:val="single" w:sz="4" w:space="0" w:color="CCCCCC"/>
-              <w:left w:val="single" w:sz="4" w:space="0" w:color="CCCCCC"/>
-              <w:right w:val="single" w:sz="4" w:space="0" w:color="CCCCCC"/>
-            </w:tcBorders>
-          </w:tcPr>
-          <w:p>
-            <w:r>
-              <w:rPr>
-                <w:rFonts w:ascii="Times New Roman" w:hAnsi="Times New Roman"/>
-                <w:b/>
-                <w:color w:val="000000"/>
-                <w:sz w:val="17"/>
-              </w:rPr>
-              <w:t>100% Satisfied - Full persistent state lifecycle</w:t>
+              <w:t>React Hooks (useState, useEffect, useRef) combined with browser localStorage synchronization for complete data persistence</w:t>
             </w:r>
           </w:p>
         </w:tc>
@@ -794,7 +743,7 @@
       <w:tr>
         <w:tc>
           <w:tcPr>
-            <w:tcW w:type="dxa" w:w="3360"/>
+            <w:tcW w:type="dxa" w:w="3456"/>
             <w:shd w:fill="F8F9FA"/>
             <w:tcMar>
               <w:top w:w="50" w:type="dxa"/>
@@ -823,7 +772,7 @@
         </w:tc>
         <w:tc>
           <w:tcPr>
-            <w:tcW w:type="dxa" w:w="3360"/>
+            <w:tcW w:type="dxa" w:w="6624"/>
             <w:shd w:fill="F8F9FA"/>
             <w:tcMar>
               <w:top w:w="50" w:type="dxa"/>
@@ -845,36 +794,7 @@
                 <w:color w:val="000000"/>
                 <w:sz w:val="17"/>
               </w:rPr>
-              <w:t>Synthetic events for form submission (onSubmit), input changes (onChange), view switches, modal actions, and keyboard Escape</w:t>
-            </w:r>
-          </w:p>
-        </w:tc>
-        <w:tc>
-          <w:tcPr>
-            <w:tcW w:type="dxa" w:w="3360"/>
-            <w:shd w:fill="F8F9FA"/>
-            <w:tcMar>
-              <w:top w:w="50" w:type="dxa"/>
-              <w:bottom w:w="50" w:type="dxa"/>
-              <w:left w:w="70" w:type="dxa"/>
-              <w:right w:w="70" w:type="dxa"/>
-            </w:tcMar>
-            <w:tcBorders>
-              <w:top w:val="single" w:sz="4" w:space="0" w:color="CCCCCC"/>
-              <w:bottom w:val="single" w:sz="4" w:space="0" w:color="CCCCCC"/>
-              <w:left w:val="single" w:sz="4" w:space="0" w:color="CCCCCC"/>
-              <w:right w:val="single" w:sz="4" w:space="0" w:color="CCCCCC"/>
-            </w:tcBorders>
-          </w:tcPr>
-          <w:p>
-            <w:r>
-              <w:rPr>
-                <w:rFonts w:ascii="Times New Roman" w:hAnsi="Times New Roman"/>
-                <w:b/>
-                <w:color w:val="000000"/>
-                <w:sz w:val="17"/>
-              </w:rPr>
-              <w:t>100% Satisfied - Comprehensive event delegation</w:t>
+              <w:t>Synthetic events for form submission (onSubmit), input changes (onChange), view switches, modal actions, and keyboard Escape listener</w:t>
             </w:r>
           </w:p>
         </w:tc>
@@ -882,7 +802,7 @@
       <w:tr>
         <w:tc>
           <w:tcPr>
-            <w:tcW w:type="dxa" w:w="3360"/>
+            <w:tcW w:type="dxa" w:w="3456"/>
             <w:shd w:fill="FFFFFF"/>
             <w:tcMar>
               <w:top w:w="50" w:type="dxa"/>
@@ -911,7 +831,7 @@
         </w:tc>
         <w:tc>
           <w:tcPr>
-            <w:tcW w:type="dxa" w:w="3360"/>
+            <w:tcW w:type="dxa" w:w="6624"/>
             <w:shd w:fill="FFFFFF"/>
             <w:tcMar>
               <w:top w:w="50" w:type="dxa"/>
@@ -933,36 +853,7 @@
                 <w:color w:val="000000"/>
                 <w:sz w:val="17"/>
               </w:rPr>
-              <w:t>Controlled form components with real-time error detection, regex email validation, and CGPA boundary checks (0.0-10.0)</w:t>
-            </w:r>
-          </w:p>
-        </w:tc>
-        <w:tc>
-          <w:tcPr>
-            <w:tcW w:type="dxa" w:w="3360"/>
-            <w:shd w:fill="FFFFFF"/>
-            <w:tcMar>
-              <w:top w:w="50" w:type="dxa"/>
-              <w:bottom w:w="50" w:type="dxa"/>
-              <w:left w:w="70" w:type="dxa"/>
-              <w:right w:w="70" w:type="dxa"/>
-            </w:tcMar>
-            <w:tcBorders>
-              <w:top w:val="single" w:sz="4" w:space="0" w:color="CCCCCC"/>
-              <w:bottom w:val="single" w:sz="4" w:space="0" w:color="CCCCCC"/>
-              <w:left w:val="single" w:sz="4" w:space="0" w:color="CCCCCC"/>
-              <w:right w:val="single" w:sz="4" w:space="0" w:color="CCCCCC"/>
-            </w:tcBorders>
-          </w:tcPr>
-          <w:p>
-            <w:r>
-              <w:rPr>
-                <w:rFonts w:ascii="Times New Roman" w:hAnsi="Times New Roman"/>
-                <w:b/>
-                <w:color w:val="000000"/>
-                <w:sz w:val="17"/>
-              </w:rPr>
-              <w:t>100% Satisfied - Instant visual feedback on errors</w:t>
+              <w:t>Controlled form components with real-time error detection, regex email validation, and CGPA boundary checks (0.0 to 10.0)</w:t>
             </w:r>
           </w:p>
         </w:tc>
@@ -970,7 +861,7 @@
       <w:tr>
         <w:tc>
           <w:tcPr>
-            <w:tcW w:type="dxa" w:w="3360"/>
+            <w:tcW w:type="dxa" w:w="3456"/>
             <w:shd w:fill="F8F9FA"/>
             <w:tcMar>
               <w:top w:w="50" w:type="dxa"/>
@@ -999,7 +890,7 @@
         </w:tc>
         <w:tc>
           <w:tcPr>
-            <w:tcW w:type="dxa" w:w="3360"/>
+            <w:tcW w:type="dxa" w:w="6624"/>
             <w:shd w:fill="F8F9FA"/>
             <w:tcMar>
               <w:top w:w="50" w:type="dxa"/>
@@ -1021,36 +912,7 @@
                 <w:color w:val="000000"/>
                 <w:sz w:val="17"/>
               </w:rPr>
-              <w:t>Create: Add student; Read: View list/cards with filters; Update: Preload &amp; save edit; Delete: Safe confirmation dialog</w:t>
-            </w:r>
-          </w:p>
-        </w:tc>
-        <w:tc>
-          <w:tcPr>
-            <w:tcW w:type="dxa" w:w="3360"/>
-            <w:shd w:fill="F8F9FA"/>
-            <w:tcMar>
-              <w:top w:w="50" w:type="dxa"/>
-              <w:bottom w:w="50" w:type="dxa"/>
-              <w:left w:w="70" w:type="dxa"/>
-              <w:right w:w="70" w:type="dxa"/>
-            </w:tcMar>
-            <w:tcBorders>
-              <w:top w:val="single" w:sz="4" w:space="0" w:color="CCCCCC"/>
-              <w:bottom w:val="single" w:sz="4" w:space="0" w:color="CCCCCC"/>
-              <w:left w:val="single" w:sz="4" w:space="0" w:color="CCCCCC"/>
-              <w:right w:val="single" w:sz="4" w:space="0" w:color="CCCCCC"/>
-            </w:tcBorders>
-          </w:tcPr>
-          <w:p>
-            <w:r>
-              <w:rPr>
-                <w:rFonts w:ascii="Times New Roman" w:hAnsi="Times New Roman"/>
-                <w:b/>
-                <w:color w:val="000000"/>
-                <w:sz w:val="17"/>
-              </w:rPr>
-              <w:t>100% Satisfied - Complete 4-step CRUD cycle</w:t>
+              <w:t>Create: Add student; Read: View list/cards with filters; Update: Preload &amp; save edit; Delete: Safe confirmation modal dialog</w:t>
             </w:r>
           </w:p>
         </w:tc>
@@ -1146,7 +1008,7 @@
               <w:br/>
               <w:t xml:space="preserve"> │              └── [Cards View]: StudentCard (Grid card presentation with dynamic CGPA progress bar and inline actions)</w:t>
               <w:br/>
-              <w:t xml:space="preserve"> ├── DeleteConfirmModal (Accessible dialog with blur backdrop preventing accidental record loss)</w:t>
+              <w:t xml:space="preserve"> ├── DeleteConfirmModal (Accessible dialog with background overlay preventing accidental record loss)</w:t>
               <w:br/>
               <w:t xml:space="preserve"> └── Toast Notification (Floating feedback alerts for Create, Update, and Delete confirmations)</w:t>
             </w:r>
@@ -1215,7 +1077,7 @@
           <w:color w:val="1E1E1E"/>
           <w:sz w:val="20"/>
         </w:rPr>
-        <w:t>The primary dashboard screen presents institutional MITAOE branding, the authenticated student chip (Sameet Pisal, PRN 202401120018), four analytical metric cards (Total Enrolled, Active Departments, Average CGPA, and Active Student count), along with the side-by-side enrollment form and records directory.</w:t>
+        <w:t>The primary dashboard screen presents institutional MITAOE branding, the Department of Data Science portal subtitle, the authenticated student chip (Sameet Pisal, PRN 202401120018), four analytical metric cards (Total Enrolled, Active Departments, Average CGPA, and Active Student count), along with the side-by-side enrollment form and records directory.</w:t>
       </w:r>
     </w:p>
     <w:p>
@@ -1271,7 +1133,7 @@
           <w:color w:val="000000"/>
           <w:sz w:val="18"/>
         </w:rPr>
-        <w:t>Figure 1: Full SIMS Dashboard with Real-time KPI Cards, Student Table, and Enrollment Panel</w:t>
+        <w:t>Figure 1: Full SIMS Dashboard with Real-time KPI Cards, Student Table, and Enrollment Panel (Department of Data Science)</w:t>
       </w:r>
     </w:p>
     <w:p>
@@ -1467,7 +1329,7 @@
           <w:color w:val="1E1E1E"/>
           <w:sz w:val="20"/>
         </w:rPr>
-        <w:t>To prevent accidental data loss, clicking the Delete icon opens a modal dialog overlay with a frosted backdrop. The modal explicitly displays the target student's name and PRN (demonstrated with Vikram Deshmukh, PRN 202301120019), requiring user confirmation before permanently modifying state.</w:t>
+        <w:t>To prevent accidental data loss, clicking the Delete icon opens a modal dialog overlay with a backdrop. The modal explicitly displays the target student's name and PRN (demonstrated with Vikram Deshmukh, PRN 202301120019), requiring user confirmation before permanently modifying state.</w:t>
       </w:r>
     </w:p>
     <w:p>
@@ -1551,7 +1413,7 @@
           <w:color w:val="1E1E1E"/>
           <w:sz w:val="20"/>
         </w:rPr>
-        <w:t>The search bar supports instant real-time filtering across Student Name, PRN, Roll Number, and Department without page reloads. Figure 5 illustrates a search query for 'Computer', filtering the directory to only students belonging to the Computer Engineering department (Aditi Sharma and Sameet Pisal).</w:t>
+        <w:t>The search bar supports instant real-time filtering across Student Name, PRN, Roll Number, and Department without page reloads. Figure 5 illustrates a search query for 'Data Science', filtering the directory to only students belonging to the Data Science department (Rohan Patil and Sameet Pisal).</w:t>
       </w:r>
     </w:p>
     <w:p>
@@ -1607,7 +1469,7 @@
           <w:color w:val="000000"/>
           <w:sz w:val="18"/>
         </w:rPr>
-        <w:t>Figure 5: Live Search Filtering showing matched student records and dynamic result counts</w:t>
+        <w:t>Figure 5: Live Search Filtering showing matched Data Science student records and dynamic result counts</w:t>
       </w:r>
     </w:p>
     <w:p>
@@ -1815,7 +1677,7 @@
               <w:br/>
               <w:t xml:space="preserve">  const [students, setStudents] = useState(() =&gt; {</w:t>
               <w:br/>
-              <w:t xml:space="preserve">    const saved = localStorage.getItem('mitaoe_students_data');</w:t>
+              <w:t xml:space="preserve">    const saved = localStorage.getItem('mitaoe_students_ds_data');</w:t>
               <w:br/>
               <w:t xml:space="preserve">    return saved ? JSON.parse(saved) : INITIAL_STUDENTS;</w:t>
               <w:br/>
@@ -1824,7 +1686,7 @@
               <w:br/>
               <w:t xml:space="preserve">  useEffect(() =&gt; {</w:t>
               <w:br/>
-              <w:t xml:space="preserve">    localStorage.setItem('mitaoe_students_data', JSON.stringify(students));</w:t>
+              <w:t xml:space="preserve">    localStorage.setItem('mitaoe_students_ds_data', JSON.stringify(students));</w:t>
               <w:br/>
               <w:t xml:space="preserve">  }, [students]);</w:t>
               <w:br/>
@@ -2035,7 +1897,7 @@
               <w:br/>
               <w:t xml:space="preserve">  const [formData, setFormData] = useState({</w:t>
               <w:br/>
-              <w:t xml:space="preserve">    name: '', rollNumber: '', prn: '', department: 'Computer Engineering',</w:t>
+              <w:t xml:space="preserve">    name: '', rollNumber: '', prn: '', department: 'Data Science',</w:t>
               <w:br/>
               <w:t xml:space="preserve">    semester: 'Semester 5', email: '', cgpa: '', status: 'Active'</w:t>
               <w:br/>
@@ -2048,7 +1910,7 @@
               <w:br/>
               <w:t xml:space="preserve">    if (editingStudent) setFormData(editingStudent);</w:t>
               <w:br/>
-              <w:t xml:space="preserve">    else setFormData({ name: '', rollNumber: '', prn: '', department: 'Computer Engineering',</w:t>
+              <w:t xml:space="preserve">    else setFormData({ name: '', rollNumber: '', prn: '', department: 'Data Science',</w:t>
               <w:br/>
               <w:t xml:space="preserve">                       semester: 'Semester 5', email: '', cgpa: '', status: 'Active' });</w:t>
               <w:br/>
@@ -2162,7 +2024,7 @@
           <w:color w:val="000000"/>
           <w:sz w:val="24"/>
         </w:rPr>
-        <w:t>6. TEST CASES &amp; VERIFICATION MATRIX</w:t>
+        <w:t>6. CONCLUSION &amp; LEARNING OUTCOMES</w:t>
       </w:r>
     </w:p>
     <w:p>
@@ -2175,841 +2037,7 @@
           <w:color w:val="1E1E1E"/>
           <w:sz w:val="20"/>
         </w:rPr>
-        <w:t>The system underwent thorough functional testing covering all CRUD and state behaviors:</w:t>
-      </w:r>
-    </w:p>
-    <w:tbl>
-      <w:tblPr>
-        <w:tblW w:type="auto" w:w="0"/>
-        <w:jc w:val="center"/>
-        <w:tblLook w:firstColumn="1" w:firstRow="1" w:lastColumn="0" w:lastRow="0" w:noHBand="0" w:noVBand="1" w:val="04A0"/>
-      </w:tblPr>
-      <w:tblGrid>
-        <w:gridCol w:w="2520"/>
-        <w:gridCol w:w="2520"/>
-        <w:gridCol w:w="2520"/>
-        <w:gridCol w:w="2520"/>
-      </w:tblGrid>
-      <w:tr>
-        <w:tc>
-          <w:tcPr>
-            <w:tcW w:type="dxa" w:w="2520"/>
-            <w:shd w:fill="1E293B"/>
-            <w:tcMar>
-              <w:top w:w="60" w:type="dxa"/>
-              <w:bottom w:w="60" w:type="dxa"/>
-              <w:left w:w="80" w:type="dxa"/>
-              <w:right w:w="80" w:type="dxa"/>
-            </w:tcMar>
-          </w:tcPr>
-          <w:p>
-            <w:r>
-              <w:rPr>
-                <w:rFonts w:ascii="Times New Roman" w:hAnsi="Times New Roman"/>
-                <w:b/>
-                <w:color w:val="FFFFFF"/>
-                <w:sz w:val="18"/>
-              </w:rPr>
-              <w:t>Test ID</w:t>
-            </w:r>
-          </w:p>
-        </w:tc>
-        <w:tc>
-          <w:tcPr>
-            <w:tcW w:type="dxa" w:w="2520"/>
-            <w:shd w:fill="1E293B"/>
-            <w:tcMar>
-              <w:top w:w="60" w:type="dxa"/>
-              <w:bottom w:w="60" w:type="dxa"/>
-              <w:left w:w="80" w:type="dxa"/>
-              <w:right w:w="80" w:type="dxa"/>
-            </w:tcMar>
-          </w:tcPr>
-          <w:p>
-            <w:r>
-              <w:rPr>
-                <w:rFonts w:ascii="Times New Roman" w:hAnsi="Times New Roman"/>
-                <w:b/>
-                <w:color w:val="FFFFFF"/>
-                <w:sz w:val="18"/>
-              </w:rPr>
-              <w:t>Test Scenario</w:t>
-            </w:r>
-          </w:p>
-        </w:tc>
-        <w:tc>
-          <w:tcPr>
-            <w:tcW w:type="dxa" w:w="2520"/>
-            <w:shd w:fill="1E293B"/>
-            <w:tcMar>
-              <w:top w:w="60" w:type="dxa"/>
-              <w:bottom w:w="60" w:type="dxa"/>
-              <w:left w:w="80" w:type="dxa"/>
-              <w:right w:w="80" w:type="dxa"/>
-            </w:tcMar>
-          </w:tcPr>
-          <w:p>
-            <w:r>
-              <w:rPr>
-                <w:rFonts w:ascii="Times New Roman" w:hAnsi="Times New Roman"/>
-                <w:b/>
-                <w:color w:val="FFFFFF"/>
-                <w:sz w:val="18"/>
-              </w:rPr>
-              <w:t>Expected Outcome</w:t>
-            </w:r>
-          </w:p>
-        </w:tc>
-        <w:tc>
-          <w:tcPr>
-            <w:tcW w:type="dxa" w:w="2520"/>
-            <w:shd w:fill="1E293B"/>
-            <w:tcMar>
-              <w:top w:w="60" w:type="dxa"/>
-              <w:bottom w:w="60" w:type="dxa"/>
-              <w:left w:w="80" w:type="dxa"/>
-              <w:right w:w="80" w:type="dxa"/>
-            </w:tcMar>
-          </w:tcPr>
-          <w:p>
-            <w:r>
-              <w:rPr>
-                <w:rFonts w:ascii="Times New Roman" w:hAnsi="Times New Roman"/>
-                <w:b/>
-                <w:color w:val="FFFFFF"/>
-                <w:sz w:val="18"/>
-              </w:rPr>
-              <w:t>Pass / Fail</w:t>
-            </w:r>
-          </w:p>
-        </w:tc>
-      </w:tr>
-      <w:tr>
-        <w:tc>
-          <w:tcPr>
-            <w:tcW w:type="dxa" w:w="2520"/>
-            <w:shd w:fill="FFFFFF"/>
-            <w:tcMar>
-              <w:top w:w="50" w:type="dxa"/>
-              <w:bottom w:w="50" w:type="dxa"/>
-              <w:left w:w="70" w:type="dxa"/>
-              <w:right w:w="70" w:type="dxa"/>
-            </w:tcMar>
-            <w:tcBorders>
-              <w:top w:val="single" w:sz="4" w:space="0" w:color="CCCCCC"/>
-              <w:bottom w:val="single" w:sz="4" w:space="0" w:color="CCCCCC"/>
-              <w:left w:val="single" w:sz="4" w:space="0" w:color="CCCCCC"/>
-              <w:right w:val="single" w:sz="4" w:space="0" w:color="CCCCCC"/>
-            </w:tcBorders>
-          </w:tcPr>
-          <w:p>
-            <w:r>
-              <w:rPr>
-                <w:rFonts w:ascii="Times New Roman" w:hAnsi="Times New Roman"/>
-                <w:b/>
-                <w:color w:val="000000"/>
-                <w:sz w:val="17"/>
-              </w:rPr>
-              <w:t>TC-01</w:t>
-            </w:r>
-          </w:p>
-        </w:tc>
-        <w:tc>
-          <w:tcPr>
-            <w:tcW w:type="dxa" w:w="2520"/>
-            <w:shd w:fill="FFFFFF"/>
-            <w:tcMar>
-              <w:top w:w="50" w:type="dxa"/>
-              <w:bottom w:w="50" w:type="dxa"/>
-              <w:left w:w="70" w:type="dxa"/>
-              <w:right w:w="70" w:type="dxa"/>
-            </w:tcMar>
-            <w:tcBorders>
-              <w:top w:val="single" w:sz="4" w:space="0" w:color="CCCCCC"/>
-              <w:bottom w:val="single" w:sz="4" w:space="0" w:color="CCCCCC"/>
-              <w:left w:val="single" w:sz="4" w:space="0" w:color="CCCCCC"/>
-              <w:right w:val="single" w:sz="4" w:space="0" w:color="CCCCCC"/>
-            </w:tcBorders>
-          </w:tcPr>
-          <w:p>
-            <w:r>
-              <w:rPr>
-                <w:rFonts w:ascii="Times New Roman" w:hAnsi="Times New Roman"/>
-                <w:color w:val="000000"/>
-                <w:sz w:val="17"/>
-              </w:rPr>
-              <w:t>Create: Enroll student with complete valid credentials</w:t>
-            </w:r>
-          </w:p>
-        </w:tc>
-        <w:tc>
-          <w:tcPr>
-            <w:tcW w:type="dxa" w:w="2520"/>
-            <w:shd w:fill="FFFFFF"/>
-            <w:tcMar>
-              <w:top w:w="50" w:type="dxa"/>
-              <w:bottom w:w="50" w:type="dxa"/>
-              <w:left w:w="70" w:type="dxa"/>
-              <w:right w:w="70" w:type="dxa"/>
-            </w:tcMar>
-            <w:tcBorders>
-              <w:top w:val="single" w:sz="4" w:space="0" w:color="CCCCCC"/>
-              <w:bottom w:val="single" w:sz="4" w:space="0" w:color="CCCCCC"/>
-              <w:left w:val="single" w:sz="4" w:space="0" w:color="CCCCCC"/>
-              <w:right w:val="single" w:sz="4" w:space="0" w:color="CCCCCC"/>
-            </w:tcBorders>
-          </w:tcPr>
-          <w:p>
-            <w:r>
-              <w:rPr>
-                <w:rFonts w:ascii="Times New Roman" w:hAnsi="Times New Roman"/>
-                <w:color w:val="000000"/>
-                <w:sz w:val="17"/>
-              </w:rPr>
-              <w:t>Record is added to top of table/card view; stats cards increment; saved to localStorage</w:t>
-            </w:r>
-          </w:p>
-        </w:tc>
-        <w:tc>
-          <w:tcPr>
-            <w:tcW w:type="dxa" w:w="2520"/>
-            <w:shd w:fill="FFFFFF"/>
-            <w:tcMar>
-              <w:top w:w="50" w:type="dxa"/>
-              <w:bottom w:w="50" w:type="dxa"/>
-              <w:left w:w="70" w:type="dxa"/>
-              <w:right w:w="70" w:type="dxa"/>
-            </w:tcMar>
-            <w:tcBorders>
-              <w:top w:val="single" w:sz="4" w:space="0" w:color="CCCCCC"/>
-              <w:bottom w:val="single" w:sz="4" w:space="0" w:color="CCCCCC"/>
-              <w:left w:val="single" w:sz="4" w:space="0" w:color="CCCCCC"/>
-              <w:right w:val="single" w:sz="4" w:space="0" w:color="CCCCCC"/>
-            </w:tcBorders>
-          </w:tcPr>
-          <w:p>
-            <w:r>
-              <w:rPr>
-                <w:rFonts w:ascii="Times New Roman" w:hAnsi="Times New Roman"/>
-                <w:b/>
-                <w:color w:val="000000"/>
-                <w:sz w:val="17"/>
-              </w:rPr>
-              <w:t>PASS</w:t>
-            </w:r>
-          </w:p>
-        </w:tc>
-      </w:tr>
-      <w:tr>
-        <w:tc>
-          <w:tcPr>
-            <w:tcW w:type="dxa" w:w="2520"/>
-            <w:shd w:fill="F8F9FA"/>
-            <w:tcMar>
-              <w:top w:w="50" w:type="dxa"/>
-              <w:bottom w:w="50" w:type="dxa"/>
-              <w:left w:w="70" w:type="dxa"/>
-              <w:right w:w="70" w:type="dxa"/>
-            </w:tcMar>
-            <w:tcBorders>
-              <w:top w:val="single" w:sz="4" w:space="0" w:color="CCCCCC"/>
-              <w:bottom w:val="single" w:sz="4" w:space="0" w:color="CCCCCC"/>
-              <w:left w:val="single" w:sz="4" w:space="0" w:color="CCCCCC"/>
-              <w:right w:val="single" w:sz="4" w:space="0" w:color="CCCCCC"/>
-            </w:tcBorders>
-          </w:tcPr>
-          <w:p>
-            <w:r>
-              <w:rPr>
-                <w:rFonts w:ascii="Times New Roman" w:hAnsi="Times New Roman"/>
-                <w:b/>
-                <w:color w:val="000000"/>
-                <w:sz w:val="17"/>
-              </w:rPr>
-              <w:t>TC-02</w:t>
-            </w:r>
-          </w:p>
-        </w:tc>
-        <w:tc>
-          <w:tcPr>
-            <w:tcW w:type="dxa" w:w="2520"/>
-            <w:shd w:fill="F8F9FA"/>
-            <w:tcMar>
-              <w:top w:w="50" w:type="dxa"/>
-              <w:bottom w:w="50" w:type="dxa"/>
-              <w:left w:w="70" w:type="dxa"/>
-              <w:right w:w="70" w:type="dxa"/>
-            </w:tcMar>
-            <w:tcBorders>
-              <w:top w:val="single" w:sz="4" w:space="0" w:color="CCCCCC"/>
-              <w:bottom w:val="single" w:sz="4" w:space="0" w:color="CCCCCC"/>
-              <w:left w:val="single" w:sz="4" w:space="0" w:color="CCCCCC"/>
-              <w:right w:val="single" w:sz="4" w:space="0" w:color="CCCCCC"/>
-            </w:tcBorders>
-          </w:tcPr>
-          <w:p>
-            <w:r>
-              <w:rPr>
-                <w:rFonts w:ascii="Times New Roman" w:hAnsi="Times New Roman"/>
-                <w:color w:val="000000"/>
-                <w:sz w:val="17"/>
-              </w:rPr>
-              <w:t>Validation: Submit form with missing PRN or invalid email</w:t>
-            </w:r>
-          </w:p>
-        </w:tc>
-        <w:tc>
-          <w:tcPr>
-            <w:tcW w:type="dxa" w:w="2520"/>
-            <w:shd w:fill="F8F9FA"/>
-            <w:tcMar>
-              <w:top w:w="50" w:type="dxa"/>
-              <w:bottom w:w="50" w:type="dxa"/>
-              <w:left w:w="70" w:type="dxa"/>
-              <w:right w:w="70" w:type="dxa"/>
-            </w:tcMar>
-            <w:tcBorders>
-              <w:top w:val="single" w:sz="4" w:space="0" w:color="CCCCCC"/>
-              <w:bottom w:val="single" w:sz="4" w:space="0" w:color="CCCCCC"/>
-              <w:left w:val="single" w:sz="4" w:space="0" w:color="CCCCCC"/>
-              <w:right w:val="single" w:sz="4" w:space="0" w:color="CCCCCC"/>
-            </w:tcBorders>
-          </w:tcPr>
-          <w:p>
-            <w:r>
-              <w:rPr>
-                <w:rFonts w:ascii="Times New Roman" w:hAnsi="Times New Roman"/>
-                <w:color w:val="000000"/>
-                <w:sz w:val="17"/>
-              </w:rPr>
-              <w:t>Form submission blocked; red warning borders and descriptive field errors appear</w:t>
-            </w:r>
-          </w:p>
-        </w:tc>
-        <w:tc>
-          <w:tcPr>
-            <w:tcW w:type="dxa" w:w="2520"/>
-            <w:shd w:fill="F8F9FA"/>
-            <w:tcMar>
-              <w:top w:w="50" w:type="dxa"/>
-              <w:bottom w:w="50" w:type="dxa"/>
-              <w:left w:w="70" w:type="dxa"/>
-              <w:right w:w="70" w:type="dxa"/>
-            </w:tcMar>
-            <w:tcBorders>
-              <w:top w:val="single" w:sz="4" w:space="0" w:color="CCCCCC"/>
-              <w:bottom w:val="single" w:sz="4" w:space="0" w:color="CCCCCC"/>
-              <w:left w:val="single" w:sz="4" w:space="0" w:color="CCCCCC"/>
-              <w:right w:val="single" w:sz="4" w:space="0" w:color="CCCCCC"/>
-            </w:tcBorders>
-          </w:tcPr>
-          <w:p>
-            <w:r>
-              <w:rPr>
-                <w:rFonts w:ascii="Times New Roman" w:hAnsi="Times New Roman"/>
-                <w:b/>
-                <w:color w:val="000000"/>
-                <w:sz w:val="17"/>
-              </w:rPr>
-              <w:t>PASS</w:t>
-            </w:r>
-          </w:p>
-        </w:tc>
-      </w:tr>
-      <w:tr>
-        <w:tc>
-          <w:tcPr>
-            <w:tcW w:type="dxa" w:w="2520"/>
-            <w:shd w:fill="FFFFFF"/>
-            <w:tcMar>
-              <w:top w:w="50" w:type="dxa"/>
-              <w:bottom w:w="50" w:type="dxa"/>
-              <w:left w:w="70" w:type="dxa"/>
-              <w:right w:w="70" w:type="dxa"/>
-            </w:tcMar>
-            <w:tcBorders>
-              <w:top w:val="single" w:sz="4" w:space="0" w:color="CCCCCC"/>
-              <w:bottom w:val="single" w:sz="4" w:space="0" w:color="CCCCCC"/>
-              <w:left w:val="single" w:sz="4" w:space="0" w:color="CCCCCC"/>
-              <w:right w:val="single" w:sz="4" w:space="0" w:color="CCCCCC"/>
-            </w:tcBorders>
-          </w:tcPr>
-          <w:p>
-            <w:r>
-              <w:rPr>
-                <w:rFonts w:ascii="Times New Roman" w:hAnsi="Times New Roman"/>
-                <w:b/>
-                <w:color w:val="000000"/>
-                <w:sz w:val="17"/>
-              </w:rPr>
-              <w:t>TC-03</w:t>
-            </w:r>
-          </w:p>
-        </w:tc>
-        <w:tc>
-          <w:tcPr>
-            <w:tcW w:type="dxa" w:w="2520"/>
-            <w:shd w:fill="FFFFFF"/>
-            <w:tcMar>
-              <w:top w:w="50" w:type="dxa"/>
-              <w:bottom w:w="50" w:type="dxa"/>
-              <w:left w:w="70" w:type="dxa"/>
-              <w:right w:w="70" w:type="dxa"/>
-            </w:tcMar>
-            <w:tcBorders>
-              <w:top w:val="single" w:sz="4" w:space="0" w:color="CCCCCC"/>
-              <w:bottom w:val="single" w:sz="4" w:space="0" w:color="CCCCCC"/>
-              <w:left w:val="single" w:sz="4" w:space="0" w:color="CCCCCC"/>
-              <w:right w:val="single" w:sz="4" w:space="0" w:color="CCCCCC"/>
-            </w:tcBorders>
-          </w:tcPr>
-          <w:p>
-            <w:r>
-              <w:rPr>
-                <w:rFonts w:ascii="Times New Roman" w:hAnsi="Times New Roman"/>
-                <w:color w:val="000000"/>
-                <w:sz w:val="17"/>
-              </w:rPr>
-              <w:t>Read: Dynamic filter by branch or typing student name in search</w:t>
-            </w:r>
-          </w:p>
-        </w:tc>
-        <w:tc>
-          <w:tcPr>
-            <w:tcW w:type="dxa" w:w="2520"/>
-            <w:shd w:fill="FFFFFF"/>
-            <w:tcMar>
-              <w:top w:w="50" w:type="dxa"/>
-              <w:bottom w:w="50" w:type="dxa"/>
-              <w:left w:w="70" w:type="dxa"/>
-              <w:right w:w="70" w:type="dxa"/>
-            </w:tcMar>
-            <w:tcBorders>
-              <w:top w:val="single" w:sz="4" w:space="0" w:color="CCCCCC"/>
-              <w:bottom w:val="single" w:sz="4" w:space="0" w:color="CCCCCC"/>
-              <w:left w:val="single" w:sz="4" w:space="0" w:color="CCCCCC"/>
-              <w:right w:val="single" w:sz="4" w:space="0" w:color="CCCCCC"/>
-            </w:tcBorders>
-          </w:tcPr>
-          <w:p>
-            <w:r>
-              <w:rPr>
-                <w:rFonts w:ascii="Times New Roman" w:hAnsi="Times New Roman"/>
-                <w:color w:val="000000"/>
-                <w:sz w:val="17"/>
-              </w:rPr>
-              <w:t>Table dynamically filters in real-time without reloading; match count updates correctly</w:t>
-            </w:r>
-          </w:p>
-        </w:tc>
-        <w:tc>
-          <w:tcPr>
-            <w:tcW w:type="dxa" w:w="2520"/>
-            <w:shd w:fill="FFFFFF"/>
-            <w:tcMar>
-              <w:top w:w="50" w:type="dxa"/>
-              <w:bottom w:w="50" w:type="dxa"/>
-              <w:left w:w="70" w:type="dxa"/>
-              <w:right w:w="70" w:type="dxa"/>
-            </w:tcMar>
-            <w:tcBorders>
-              <w:top w:val="single" w:sz="4" w:space="0" w:color="CCCCCC"/>
-              <w:bottom w:val="single" w:sz="4" w:space="0" w:color="CCCCCC"/>
-              <w:left w:val="single" w:sz="4" w:space="0" w:color="CCCCCC"/>
-              <w:right w:val="single" w:sz="4" w:space="0" w:color="CCCCCC"/>
-            </w:tcBorders>
-          </w:tcPr>
-          <w:p>
-            <w:r>
-              <w:rPr>
-                <w:rFonts w:ascii="Times New Roman" w:hAnsi="Times New Roman"/>
-                <w:b/>
-                <w:color w:val="000000"/>
-                <w:sz w:val="17"/>
-              </w:rPr>
-              <w:t>PASS</w:t>
-            </w:r>
-          </w:p>
-        </w:tc>
-      </w:tr>
-      <w:tr>
-        <w:tc>
-          <w:tcPr>
-            <w:tcW w:type="dxa" w:w="2520"/>
-            <w:shd w:fill="F8F9FA"/>
-            <w:tcMar>
-              <w:top w:w="50" w:type="dxa"/>
-              <w:bottom w:w="50" w:type="dxa"/>
-              <w:left w:w="70" w:type="dxa"/>
-              <w:right w:w="70" w:type="dxa"/>
-            </w:tcMar>
-            <w:tcBorders>
-              <w:top w:val="single" w:sz="4" w:space="0" w:color="CCCCCC"/>
-              <w:bottom w:val="single" w:sz="4" w:space="0" w:color="CCCCCC"/>
-              <w:left w:val="single" w:sz="4" w:space="0" w:color="CCCCCC"/>
-              <w:right w:val="single" w:sz="4" w:space="0" w:color="CCCCCC"/>
-            </w:tcBorders>
-          </w:tcPr>
-          <w:p>
-            <w:r>
-              <w:rPr>
-                <w:rFonts w:ascii="Times New Roman" w:hAnsi="Times New Roman"/>
-                <w:b/>
-                <w:color w:val="000000"/>
-                <w:sz w:val="17"/>
-              </w:rPr>
-              <w:t>TC-04</w:t>
-            </w:r>
-          </w:p>
-        </w:tc>
-        <w:tc>
-          <w:tcPr>
-            <w:tcW w:type="dxa" w:w="2520"/>
-            <w:shd w:fill="F8F9FA"/>
-            <w:tcMar>
-              <w:top w:w="50" w:type="dxa"/>
-              <w:bottom w:w="50" w:type="dxa"/>
-              <w:left w:w="70" w:type="dxa"/>
-              <w:right w:w="70" w:type="dxa"/>
-            </w:tcMar>
-            <w:tcBorders>
-              <w:top w:val="single" w:sz="4" w:space="0" w:color="CCCCCC"/>
-              <w:bottom w:val="single" w:sz="4" w:space="0" w:color="CCCCCC"/>
-              <w:left w:val="single" w:sz="4" w:space="0" w:color="CCCCCC"/>
-              <w:right w:val="single" w:sz="4" w:space="0" w:color="CCCCCC"/>
-            </w:tcBorders>
-          </w:tcPr>
-          <w:p>
-            <w:r>
-              <w:rPr>
-                <w:rFonts w:ascii="Times New Roman" w:hAnsi="Times New Roman"/>
-                <w:color w:val="000000"/>
-                <w:sz w:val="17"/>
-              </w:rPr>
-              <w:t>Update: Click 'Edit', modify student's CGPA or email, and submit</w:t>
-            </w:r>
-          </w:p>
-        </w:tc>
-        <w:tc>
-          <w:tcPr>
-            <w:tcW w:type="dxa" w:w="2520"/>
-            <w:shd w:fill="F8F9FA"/>
-            <w:tcMar>
-              <w:top w:w="50" w:type="dxa"/>
-              <w:bottom w:w="50" w:type="dxa"/>
-              <w:left w:w="70" w:type="dxa"/>
-              <w:right w:w="70" w:type="dxa"/>
-            </w:tcMar>
-            <w:tcBorders>
-              <w:top w:val="single" w:sz="4" w:space="0" w:color="CCCCCC"/>
-              <w:bottom w:val="single" w:sz="4" w:space="0" w:color="CCCCCC"/>
-              <w:left w:val="single" w:sz="4" w:space="0" w:color="CCCCCC"/>
-              <w:right w:val="single" w:sz="4" w:space="0" w:color="CCCCCC"/>
-            </w:tcBorders>
-          </w:tcPr>
-          <w:p>
-            <w:r>
-              <w:rPr>
-                <w:rFonts w:ascii="Times New Roman" w:hAnsi="Times New Roman"/>
-                <w:color w:val="000000"/>
-                <w:sz w:val="17"/>
-              </w:rPr>
-              <w:t>Form updates target record in state and localStorage; switches back to Enroll mode</w:t>
-            </w:r>
-          </w:p>
-        </w:tc>
-        <w:tc>
-          <w:tcPr>
-            <w:tcW w:type="dxa" w:w="2520"/>
-            <w:shd w:fill="F8F9FA"/>
-            <w:tcMar>
-              <w:top w:w="50" w:type="dxa"/>
-              <w:bottom w:w="50" w:type="dxa"/>
-              <w:left w:w="70" w:type="dxa"/>
-              <w:right w:w="70" w:type="dxa"/>
-            </w:tcMar>
-            <w:tcBorders>
-              <w:top w:val="single" w:sz="4" w:space="0" w:color="CCCCCC"/>
-              <w:bottom w:val="single" w:sz="4" w:space="0" w:color="CCCCCC"/>
-              <w:left w:val="single" w:sz="4" w:space="0" w:color="CCCCCC"/>
-              <w:right w:val="single" w:sz="4" w:space="0" w:color="CCCCCC"/>
-            </w:tcBorders>
-          </w:tcPr>
-          <w:p>
-            <w:r>
-              <w:rPr>
-                <w:rFonts w:ascii="Times New Roman" w:hAnsi="Times New Roman"/>
-                <w:b/>
-                <w:color w:val="000000"/>
-                <w:sz w:val="17"/>
-              </w:rPr>
-              <w:t>PASS</w:t>
-            </w:r>
-          </w:p>
-        </w:tc>
-      </w:tr>
-      <w:tr>
-        <w:tc>
-          <w:tcPr>
-            <w:tcW w:type="dxa" w:w="2520"/>
-            <w:shd w:fill="FFFFFF"/>
-            <w:tcMar>
-              <w:top w:w="50" w:type="dxa"/>
-              <w:bottom w:w="50" w:type="dxa"/>
-              <w:left w:w="70" w:type="dxa"/>
-              <w:right w:w="70" w:type="dxa"/>
-            </w:tcMar>
-            <w:tcBorders>
-              <w:top w:val="single" w:sz="4" w:space="0" w:color="CCCCCC"/>
-              <w:bottom w:val="single" w:sz="4" w:space="0" w:color="CCCCCC"/>
-              <w:left w:val="single" w:sz="4" w:space="0" w:color="CCCCCC"/>
-              <w:right w:val="single" w:sz="4" w:space="0" w:color="CCCCCC"/>
-            </w:tcBorders>
-          </w:tcPr>
-          <w:p>
-            <w:r>
-              <w:rPr>
-                <w:rFonts w:ascii="Times New Roman" w:hAnsi="Times New Roman"/>
-                <w:b/>
-                <w:color w:val="000000"/>
-                <w:sz w:val="17"/>
-              </w:rPr>
-              <w:t>TC-05</w:t>
-            </w:r>
-          </w:p>
-        </w:tc>
-        <w:tc>
-          <w:tcPr>
-            <w:tcW w:type="dxa" w:w="2520"/>
-            <w:shd w:fill="FFFFFF"/>
-            <w:tcMar>
-              <w:top w:w="50" w:type="dxa"/>
-              <w:bottom w:w="50" w:type="dxa"/>
-              <w:left w:w="70" w:type="dxa"/>
-              <w:right w:w="70" w:type="dxa"/>
-            </w:tcMar>
-            <w:tcBorders>
-              <w:top w:val="single" w:sz="4" w:space="0" w:color="CCCCCC"/>
-              <w:bottom w:val="single" w:sz="4" w:space="0" w:color="CCCCCC"/>
-              <w:left w:val="single" w:sz="4" w:space="0" w:color="CCCCCC"/>
-              <w:right w:val="single" w:sz="4" w:space="0" w:color="CCCCCC"/>
-            </w:tcBorders>
-          </w:tcPr>
-          <w:p>
-            <w:r>
-              <w:rPr>
-                <w:rFonts w:ascii="Times New Roman" w:hAnsi="Times New Roman"/>
-                <w:color w:val="000000"/>
-                <w:sz w:val="17"/>
-              </w:rPr>
-              <w:t>Delete: Click 'Delete' button on a record row</w:t>
-            </w:r>
-          </w:p>
-        </w:tc>
-        <w:tc>
-          <w:tcPr>
-            <w:tcW w:type="dxa" w:w="2520"/>
-            <w:shd w:fill="FFFFFF"/>
-            <w:tcMar>
-              <w:top w:w="50" w:type="dxa"/>
-              <w:bottom w:w="50" w:type="dxa"/>
-              <w:left w:w="70" w:type="dxa"/>
-              <w:right w:w="70" w:type="dxa"/>
-            </w:tcMar>
-            <w:tcBorders>
-              <w:top w:val="single" w:sz="4" w:space="0" w:color="CCCCCC"/>
-              <w:bottom w:val="single" w:sz="4" w:space="0" w:color="CCCCCC"/>
-              <w:left w:val="single" w:sz="4" w:space="0" w:color="CCCCCC"/>
-              <w:right w:val="single" w:sz="4" w:space="0" w:color="CCCCCC"/>
-            </w:tcBorders>
-          </w:tcPr>
-          <w:p>
-            <w:r>
-              <w:rPr>
-                <w:rFonts w:ascii="Times New Roman" w:hAnsi="Times New Roman"/>
-                <w:color w:val="000000"/>
-                <w:sz w:val="17"/>
-              </w:rPr>
-              <w:t>Modal confirmation dialog opens; clicking confirm removes record; stats update</w:t>
-            </w:r>
-          </w:p>
-        </w:tc>
-        <w:tc>
-          <w:tcPr>
-            <w:tcW w:type="dxa" w:w="2520"/>
-            <w:shd w:fill="FFFFFF"/>
-            <w:tcMar>
-              <w:top w:w="50" w:type="dxa"/>
-              <w:bottom w:w="50" w:type="dxa"/>
-              <w:left w:w="70" w:type="dxa"/>
-              <w:right w:w="70" w:type="dxa"/>
-            </w:tcMar>
-            <w:tcBorders>
-              <w:top w:val="single" w:sz="4" w:space="0" w:color="CCCCCC"/>
-              <w:bottom w:val="single" w:sz="4" w:space="0" w:color="CCCCCC"/>
-              <w:left w:val="single" w:sz="4" w:space="0" w:color="CCCCCC"/>
-              <w:right w:val="single" w:sz="4" w:space="0" w:color="CCCCCC"/>
-            </w:tcBorders>
-          </w:tcPr>
-          <w:p>
-            <w:r>
-              <w:rPr>
-                <w:rFonts w:ascii="Times New Roman" w:hAnsi="Times New Roman"/>
-                <w:b/>
-                <w:color w:val="000000"/>
-                <w:sz w:val="17"/>
-              </w:rPr>
-              <w:t>PASS</w:t>
-            </w:r>
-          </w:p>
-        </w:tc>
-      </w:tr>
-      <w:tr>
-        <w:tc>
-          <w:tcPr>
-            <w:tcW w:type="dxa" w:w="2520"/>
-            <w:shd w:fill="F8F9FA"/>
-            <w:tcMar>
-              <w:top w:w="50" w:type="dxa"/>
-              <w:bottom w:w="50" w:type="dxa"/>
-              <w:left w:w="70" w:type="dxa"/>
-              <w:right w:w="70" w:type="dxa"/>
-            </w:tcMar>
-            <w:tcBorders>
-              <w:top w:val="single" w:sz="4" w:space="0" w:color="CCCCCC"/>
-              <w:bottom w:val="single" w:sz="4" w:space="0" w:color="CCCCCC"/>
-              <w:left w:val="single" w:sz="4" w:space="0" w:color="CCCCCC"/>
-              <w:right w:val="single" w:sz="4" w:space="0" w:color="CCCCCC"/>
-            </w:tcBorders>
-          </w:tcPr>
-          <w:p>
-            <w:r>
-              <w:rPr>
-                <w:rFonts w:ascii="Times New Roman" w:hAnsi="Times New Roman"/>
-                <w:b/>
-                <w:color w:val="000000"/>
-                <w:sz w:val="17"/>
-              </w:rPr>
-              <w:t>TC-06</w:t>
-            </w:r>
-          </w:p>
-        </w:tc>
-        <w:tc>
-          <w:tcPr>
-            <w:tcW w:type="dxa" w:w="2520"/>
-            <w:shd w:fill="F8F9FA"/>
-            <w:tcMar>
-              <w:top w:w="50" w:type="dxa"/>
-              <w:bottom w:w="50" w:type="dxa"/>
-              <w:left w:w="70" w:type="dxa"/>
-              <w:right w:w="70" w:type="dxa"/>
-            </w:tcMar>
-            <w:tcBorders>
-              <w:top w:val="single" w:sz="4" w:space="0" w:color="CCCCCC"/>
-              <w:bottom w:val="single" w:sz="4" w:space="0" w:color="CCCCCC"/>
-              <w:left w:val="single" w:sz="4" w:space="0" w:color="CCCCCC"/>
-              <w:right w:val="single" w:sz="4" w:space="0" w:color="CCCCCC"/>
-            </w:tcBorders>
-          </w:tcPr>
-          <w:p>
-            <w:r>
-              <w:rPr>
-                <w:rFonts w:ascii="Times New Roman" w:hAnsi="Times New Roman"/>
-                <w:color w:val="000000"/>
-                <w:sz w:val="17"/>
-              </w:rPr>
-              <w:t>Export: Click 'Export CSV' button on toolbar</w:t>
-            </w:r>
-          </w:p>
-        </w:tc>
-        <w:tc>
-          <w:tcPr>
-            <w:tcW w:type="dxa" w:w="2520"/>
-            <w:shd w:fill="F8F9FA"/>
-            <w:tcMar>
-              <w:top w:w="50" w:type="dxa"/>
-              <w:bottom w:w="50" w:type="dxa"/>
-              <w:left w:w="70" w:type="dxa"/>
-              <w:right w:w="70" w:type="dxa"/>
-            </w:tcMar>
-            <w:tcBorders>
-              <w:top w:val="single" w:sz="4" w:space="0" w:color="CCCCCC"/>
-              <w:bottom w:val="single" w:sz="4" w:space="0" w:color="CCCCCC"/>
-              <w:left w:val="single" w:sz="4" w:space="0" w:color="CCCCCC"/>
-              <w:right w:val="single" w:sz="4" w:space="0" w:color="CCCCCC"/>
-            </w:tcBorders>
-          </w:tcPr>
-          <w:p>
-            <w:r>
-              <w:rPr>
-                <w:rFonts w:ascii="Times New Roman" w:hAnsi="Times New Roman"/>
-                <w:color w:val="000000"/>
-                <w:sz w:val="17"/>
-              </w:rPr>
-              <w:t>Browser downloads formatted .csv file containing currently filtered student records</w:t>
-            </w:r>
-          </w:p>
-        </w:tc>
-        <w:tc>
-          <w:tcPr>
-            <w:tcW w:type="dxa" w:w="2520"/>
-            <w:shd w:fill="F8F9FA"/>
-            <w:tcMar>
-              <w:top w:w="50" w:type="dxa"/>
-              <w:bottom w:w="50" w:type="dxa"/>
-              <w:left w:w="70" w:type="dxa"/>
-              <w:right w:w="70" w:type="dxa"/>
-            </w:tcMar>
-            <w:tcBorders>
-              <w:top w:val="single" w:sz="4" w:space="0" w:color="CCCCCC"/>
-              <w:bottom w:val="single" w:sz="4" w:space="0" w:color="CCCCCC"/>
-              <w:left w:val="single" w:sz="4" w:space="0" w:color="CCCCCC"/>
-              <w:right w:val="single" w:sz="4" w:space="0" w:color="CCCCCC"/>
-            </w:tcBorders>
-          </w:tcPr>
-          <w:p>
-            <w:r>
-              <w:rPr>
-                <w:rFonts w:ascii="Times New Roman" w:hAnsi="Times New Roman"/>
-                <w:b/>
-                <w:color w:val="000000"/>
-                <w:sz w:val="17"/>
-              </w:rPr>
-              <w:t>PASS</w:t>
-            </w:r>
-          </w:p>
-        </w:tc>
-      </w:tr>
-    </w:tbl>
-    <w:p>
-      <w:pPr>
-        <w:keepNext/>
-        <w:spacing w:before="280" w:after="80"/>
-        <w:pBdr>
-          <w:bottom w:val="single" w:sz="6" w:space="2" w:color="000000"/>
-        </w:pBdr>
-      </w:pPr>
-      <w:r>
-        <w:rPr>
-          <w:rFonts w:ascii="Times New Roman" w:hAnsi="Times New Roman"/>
-          <w:b/>
-          <w:color w:val="000000"/>
-          <w:sz w:val="24"/>
-        </w:rPr>
-        <w:t>7. CONCLUSION &amp; LEARNING OUTCOMES</w:t>
-      </w:r>
-    </w:p>
-    <w:p>
-      <w:pPr>
-        <w:spacing w:before="40" w:after="60" w:line="276" w:lineRule="auto"/>
-      </w:pPr>
-      <w:r>
-        <w:rPr>
-          <w:rFonts w:ascii="Times New Roman" w:hAnsi="Times New Roman"/>
-          <w:color w:val="1E1E1E"/>
-          <w:sz w:val="20"/>
-        </w:rPr>
-        <w:t>Through the successful development of this Student Management System in React JS, the core paradigms of modern frontend application engineering were masterfully demonstrated and fulfilled:</w:t>
+        <w:t>Through the successful development of this Student Management System in React JS for the Department of Data Science, the core paradigms of modern frontend application engineering were masterfully demonstrated and fulfilled:</w:t>
       </w:r>
     </w:p>
     <w:p>

</xml_diff>